<commit_message>
feat: 20251024,更新 her2 模板
</commit_message>
<xml_diff>
--- a/WebContent/docx/HER2基因扩增报告-苏州九院.docx
+++ b/WebContent/docx/HER2基因扩增报告-苏州九院.docx
@@ -244,6 +244,12 @@
             <w:insideH w:val="single" w:color="auto" w:sz="4" w:space="0"/>
             <w:insideV w:val="single" w:color="auto" w:sz="4" w:space="0"/>
           </w:tblBorders>
+          <w:tblCellMar>
+            <w:top w:w="0" w:type="dxa"/>
+            <w:left w:w="108" w:type="dxa"/>
+            <w:bottom w:w="0" w:type="dxa"/>
+            <w:right w:w="108" w:type="dxa"/>
+          </w:tblCellMar>
         </w:tblPrEx>
         <w:trPr>
           <w:trHeight w:val="667" w:hRule="atLeast"/>
@@ -1709,13 +1715,13 @@
         </w:rPr>
       </w:pPr>
       <w:bookmarkStart w:id="0" w:name="_Toc24397"/>
-      <w:bookmarkStart w:id="1" w:name="_Toc30143_WPSOffice_Level1"/>
-      <w:bookmarkStart w:id="2" w:name="_Toc13806"/>
-      <w:bookmarkStart w:id="3" w:name="_Toc24178_WPSOffice_Level1"/>
-      <w:bookmarkStart w:id="4" w:name="_Toc21009_WPSOffice_Level1"/>
-      <w:bookmarkStart w:id="5" w:name="_Toc21669"/>
-      <w:bookmarkStart w:id="6" w:name="_Toc32054"/>
-      <w:bookmarkStart w:id="7" w:name="_Toc27500"/>
+      <w:bookmarkStart w:id="1" w:name="_Toc27500"/>
+      <w:bookmarkStart w:id="2" w:name="_Toc30143_WPSOffice_Level1"/>
+      <w:bookmarkStart w:id="3" w:name="_Toc21009_WPSOffice_Level1"/>
+      <w:bookmarkStart w:id="4" w:name="_Toc21669"/>
+      <w:bookmarkStart w:id="5" w:name="_Toc32054"/>
+      <w:bookmarkStart w:id="6" w:name="_Toc13806"/>
+      <w:bookmarkStart w:id="7" w:name="_Toc24178_WPSOffice_Level1"/>
     </w:p>
     <w:p>
       <w:pPr>
@@ -5726,6 +5732,503 @@
               <w:ind w:firstLine="440" w:firstLineChars="200"/>
               <w:jc w:val="center"/>
               <w:rPr>
+                <w:rFonts w:hint="eastAsia" w:ascii="Times New Roman" w:hAnsi="Times New Roman" w:eastAsia="微软雅黑" w:cs="Times New Roman"/>
+                <w:lang w:val="en-US" w:eastAsia="zh-CN"/>
+              </w:rPr>
+            </w:pPr>
+            <w:r>
+              <w:rPr>
+                <w:rFonts w:hint="eastAsia" w:ascii="Times New Roman" w:hAnsi="Times New Roman" w:eastAsia="微软雅黑" w:cs="Times New Roman"/>
+                <w:lang w:val="en-US" w:eastAsia="zh-CN"/>
+              </w:rPr>
+              <w:t xml:space="preserve">{%tr elif her2.interpretation_standard == </w:t>
+            </w:r>
+            <w:r>
+              <w:rPr>
+                <w:rFonts w:hint="default" w:ascii="Times New Roman" w:hAnsi="Times New Roman" w:eastAsia="微软雅黑" w:cs="Times New Roman"/>
+                <w:lang w:val="en-US" w:eastAsia="zh-CN"/>
+              </w:rPr>
+              <w:t>‘</w:t>
+            </w:r>
+            <w:r>
+              <w:rPr>
+                <w:rFonts w:hint="eastAsia" w:ascii="Times New Roman" w:hAnsi="Times New Roman" w:eastAsia="微软雅黑" w:cs="Times New Roman"/>
+                <w:lang w:val="en-US" w:eastAsia="zh-CN"/>
+              </w:rPr>
+              <w:t>胆管癌</w:t>
+            </w:r>
+            <w:r>
+              <w:rPr>
+                <w:rFonts w:hint="default" w:ascii="Times New Roman" w:hAnsi="Times New Roman" w:eastAsia="微软雅黑" w:cs="Times New Roman"/>
+                <w:lang w:val="en-US" w:eastAsia="zh-CN"/>
+              </w:rPr>
+              <w:t>’</w:t>
+            </w:r>
+            <w:r>
+              <w:rPr>
+                <w:rFonts w:hint="eastAsia" w:ascii="Times New Roman" w:hAnsi="Times New Roman" w:eastAsia="微软雅黑" w:cs="Times New Roman"/>
+                <w:lang w:val="en-US" w:eastAsia="zh-CN"/>
+              </w:rPr>
+              <w:t xml:space="preserve"> %}</w:t>
+            </w:r>
+          </w:p>
+        </w:tc>
+      </w:tr>
+      <w:tr>
+        <w:tblPrEx>
+          <w:tblBorders>
+            <w:top w:val="single" w:color="5A9D46" w:sz="24" w:space="0"/>
+            <w:left w:val="none" w:color="auto" w:sz="0" w:space="0"/>
+            <w:bottom w:val="single" w:color="A4A4A4" w:sz="4" w:space="0"/>
+            <w:right w:val="none" w:color="auto" w:sz="0" w:space="0"/>
+            <w:insideH w:val="single" w:color="A4A4A4" w:sz="4" w:space="0"/>
+            <w:insideV w:val="single" w:color="A4A4A4" w:sz="4" w:space="0"/>
+          </w:tblBorders>
+          <w:tblCellMar>
+            <w:top w:w="0" w:type="dxa"/>
+            <w:left w:w="108" w:type="dxa"/>
+            <w:bottom w:w="0" w:type="dxa"/>
+            <w:right w:w="108" w:type="dxa"/>
+          </w:tblCellMar>
+        </w:tblPrEx>
+        <w:trPr>
+          <w:trHeight w:val="623" w:hRule="atLeast"/>
+          <w:jc w:val="center"/>
+        </w:trPr>
+        <w:tc>
+          <w:tcPr>
+            <w:tcW w:w="1529" w:type="dxa"/>
+            <w:tcBorders>
+              <w:tl2br w:val="nil"/>
+              <w:tr2bl w:val="nil"/>
+            </w:tcBorders>
+            <w:shd w:val="clear" w:color="auto" w:fill="auto"/>
+            <w:vAlign w:val="center"/>
+          </w:tcPr>
+          <w:p>
+            <w:pPr>
+              <w:adjustRightInd w:val="0"/>
+              <w:snapToGrid w:val="0"/>
+              <w:rPr>
+                <w:rFonts w:hint="default" w:ascii="Times New Roman" w:hAnsi="Times New Roman" w:eastAsia="微软雅黑" w:cs="Times New Roman"/>
+                <w:b/>
+                <w:kern w:val="0"/>
+                <w:sz w:val="21"/>
+                <w:szCs w:val="21"/>
+              </w:rPr>
+            </w:pPr>
+            <w:r>
+              <w:rPr>
+                <w:rFonts w:hint="default" w:ascii="Times New Roman" w:hAnsi="Times New Roman" w:eastAsia="微软雅黑" w:cs="Times New Roman"/>
+                <w:b/>
+                <w:kern w:val="0"/>
+                <w:sz w:val="21"/>
+                <w:szCs w:val="21"/>
+              </w:rPr>
+              <w:t>判读标准：</w:t>
+            </w:r>
+          </w:p>
+          <w:p>
+            <w:pPr>
+              <w:adjustRightInd w:val="0"/>
+              <w:snapToGrid w:val="0"/>
+              <w:spacing w:line="204" w:lineRule="auto"/>
+              <w:ind w:left="640" w:leftChars="211" w:hanging="176" w:hangingChars="80"/>
+              <w:rPr>
+                <w:rFonts w:hint="eastAsia" w:ascii="Times New Roman" w:hAnsi="Times New Roman" w:eastAsia="微软雅黑" w:cs="Times New Roman"/>
+                <w:lang w:val="en-US" w:eastAsia="zh-CN"/>
+              </w:rPr>
+            </w:pPr>
+          </w:p>
+        </w:tc>
+        <w:tc>
+          <w:tcPr>
+            <w:tcW w:w="8987" w:type="dxa"/>
+            <w:gridSpan w:val="4"/>
+            <w:tcBorders>
+              <w:tl2br w:val="nil"/>
+              <w:tr2bl w:val="nil"/>
+            </w:tcBorders>
+            <w:shd w:val="clear" w:color="auto" w:fill="auto"/>
+            <w:vAlign w:val="center"/>
+          </w:tcPr>
+          <w:p>
+            <w:pPr>
+              <w:adjustRightInd w:val="0"/>
+              <w:snapToGrid w:val="0"/>
+              <w:spacing w:line="204" w:lineRule="auto"/>
+              <w:jc w:val="center"/>
+              <w:rPr>
+                <w:rFonts w:hint="eastAsia" w:eastAsia="宋体"/>
+                <w:lang w:eastAsia="zh-CN"/>
+              </w:rPr>
+            </w:pPr>
+          </w:p>
+          <w:p>
+            <w:pPr>
+              <w:adjustRightInd w:val="0"/>
+              <w:snapToGrid w:val="0"/>
+              <w:spacing w:line="204" w:lineRule="auto"/>
+              <w:jc w:val="center"/>
+              <w:rPr>
+                <w:rFonts w:hint="eastAsia" w:eastAsia="宋体"/>
+                <w:lang w:eastAsia="zh-CN"/>
+              </w:rPr>
+            </w:pPr>
+            <w:r>
+              <w:drawing>
+                <wp:inline distT="0" distB="0" distL="114300" distR="114300">
+                  <wp:extent cx="5238750" cy="1974850"/>
+                  <wp:effectExtent l="0" t="0" r="6350" b="6350"/>
+                  <wp:docPr id="3" name="图片 1"/>
+                  <wp:cNvGraphicFramePr>
+                    <a:graphicFrameLocks xmlns:a="http://schemas.openxmlformats.org/drawingml/2006/main" noChangeAspect="1"/>
+                  </wp:cNvGraphicFramePr>
+                  <a:graphic xmlns:a="http://schemas.openxmlformats.org/drawingml/2006/main">
+                    <a:graphicData uri="http://schemas.openxmlformats.org/drawingml/2006/picture">
+                      <pic:pic xmlns:pic="http://schemas.openxmlformats.org/drawingml/2006/picture">
+                        <pic:nvPicPr>
+                          <pic:cNvPr id="3" name="图片 1"/>
+                          <pic:cNvPicPr>
+                            <a:picLocks noChangeAspect="1"/>
+                          </pic:cNvPicPr>
+                        </pic:nvPicPr>
+                        <pic:blipFill>
+                          <a:blip r:embed="rId9"/>
+                          <a:stretch>
+                            <a:fillRect/>
+                          </a:stretch>
+                        </pic:blipFill>
+                        <pic:spPr>
+                          <a:xfrm>
+                            <a:off x="0" y="0"/>
+                            <a:ext cx="5238750" cy="1974850"/>
+                          </a:xfrm>
+                          <a:prstGeom prst="rect">
+                            <a:avLst/>
+                          </a:prstGeom>
+                          <a:noFill/>
+                          <a:ln>
+                            <a:noFill/>
+                          </a:ln>
+                        </pic:spPr>
+                      </pic:pic>
+                    </a:graphicData>
+                  </a:graphic>
+                </wp:inline>
+              </w:drawing>
+            </w:r>
+          </w:p>
+          <w:p>
+            <w:pPr>
+              <w:adjustRightInd w:val="0"/>
+              <w:snapToGrid w:val="0"/>
+              <w:spacing w:line="204" w:lineRule="auto"/>
+              <w:jc w:val="center"/>
+              <w:rPr>
+                <w:rFonts w:hint="eastAsia" w:ascii="Times New Roman" w:hAnsi="Times New Roman" w:eastAsia="微软雅黑" w:cs="Times New Roman"/>
+                <w:lang w:val="en-US" w:eastAsia="zh-CN"/>
+              </w:rPr>
+            </w:pPr>
+            <w:r>
+              <w:rPr>
+                <w:rFonts w:hint="eastAsia" w:ascii="微软雅黑" w:hAnsi="微软雅黑" w:eastAsia="微软雅黑" w:cs="微软雅黑"/>
+                <w:sz w:val="16"/>
+                <w:szCs w:val="16"/>
+                <w:lang w:val="en-US" w:eastAsia="zh-CN"/>
+              </w:rPr>
+              <w:t>注：来源于胆道恶性肿瘤 HER2 分子诊断与临床应用中国专家共识（2024 版）</w:t>
+            </w:r>
+          </w:p>
+        </w:tc>
+      </w:tr>
+      <w:tr>
+        <w:tblPrEx>
+          <w:tblBorders>
+            <w:top w:val="single" w:color="5A9D46" w:sz="24" w:space="0"/>
+            <w:left w:val="none" w:color="auto" w:sz="0" w:space="0"/>
+            <w:bottom w:val="single" w:color="A4A4A4" w:sz="4" w:space="0"/>
+            <w:right w:val="none" w:color="auto" w:sz="0" w:space="0"/>
+            <w:insideH w:val="single" w:color="A4A4A4" w:sz="4" w:space="0"/>
+            <w:insideV w:val="single" w:color="A4A4A4" w:sz="4" w:space="0"/>
+          </w:tblBorders>
+          <w:tblCellMar>
+            <w:top w:w="0" w:type="dxa"/>
+            <w:left w:w="108" w:type="dxa"/>
+            <w:bottom w:w="0" w:type="dxa"/>
+            <w:right w:w="108" w:type="dxa"/>
+          </w:tblCellMar>
+        </w:tblPrEx>
+        <w:trPr>
+          <w:trHeight w:val="623" w:hRule="atLeast"/>
+          <w:jc w:val="center"/>
+        </w:trPr>
+        <w:tc>
+          <w:tcPr>
+            <w:tcW w:w="10516" w:type="dxa"/>
+            <w:gridSpan w:val="5"/>
+            <w:tcBorders>
+              <w:tl2br w:val="nil"/>
+              <w:tr2bl w:val="nil"/>
+            </w:tcBorders>
+            <w:shd w:val="clear" w:color="auto" w:fill="auto"/>
+            <w:vAlign w:val="center"/>
+          </w:tcPr>
+          <w:p>
+            <w:pPr>
+              <w:adjustRightInd w:val="0"/>
+              <w:snapToGrid w:val="0"/>
+              <w:spacing w:line="204" w:lineRule="auto"/>
+              <w:ind w:firstLine="440" w:firstLineChars="200"/>
+              <w:jc w:val="center"/>
+              <w:rPr>
+                <w:rFonts w:hint="eastAsia" w:ascii="Times New Roman" w:hAnsi="Times New Roman" w:eastAsia="微软雅黑" w:cs="Times New Roman"/>
+                <w:lang w:val="en-US" w:eastAsia="zh-CN"/>
+              </w:rPr>
+            </w:pPr>
+            <w:r>
+              <w:rPr>
+                <w:rFonts w:hint="eastAsia" w:ascii="Times New Roman" w:hAnsi="Times New Roman" w:eastAsia="微软雅黑" w:cs="Times New Roman"/>
+                <w:lang w:val="en-US" w:eastAsia="zh-CN"/>
+              </w:rPr>
+              <w:t xml:space="preserve">{%tr elif her2.interpretation_standard == </w:t>
+            </w:r>
+            <w:r>
+              <w:rPr>
+                <w:rFonts w:hint="default" w:ascii="Times New Roman" w:hAnsi="Times New Roman" w:eastAsia="微软雅黑" w:cs="Times New Roman"/>
+                <w:lang w:val="en-US" w:eastAsia="zh-CN"/>
+              </w:rPr>
+              <w:t>‘</w:t>
+            </w:r>
+            <w:r>
+              <w:rPr>
+                <w:rFonts w:hint="eastAsia" w:ascii="Times New Roman" w:hAnsi="Times New Roman" w:eastAsia="微软雅黑" w:cs="Times New Roman"/>
+                <w:lang w:val="en-US" w:eastAsia="zh-CN"/>
+              </w:rPr>
+              <w:t>食管和食管胃交界处癌</w:t>
+            </w:r>
+            <w:r>
+              <w:rPr>
+                <w:rFonts w:hint="default" w:ascii="Times New Roman" w:hAnsi="Times New Roman" w:eastAsia="微软雅黑" w:cs="Times New Roman"/>
+                <w:lang w:val="en-US" w:eastAsia="zh-CN"/>
+              </w:rPr>
+              <w:t>’</w:t>
+            </w:r>
+            <w:r>
+              <w:rPr>
+                <w:rFonts w:hint="eastAsia" w:ascii="Times New Roman" w:hAnsi="Times New Roman" w:eastAsia="微软雅黑" w:cs="Times New Roman"/>
+                <w:lang w:val="en-US" w:eastAsia="zh-CN"/>
+              </w:rPr>
+              <w:t xml:space="preserve"> %}</w:t>
+            </w:r>
+          </w:p>
+        </w:tc>
+      </w:tr>
+      <w:tr>
+        <w:tblPrEx>
+          <w:tblBorders>
+            <w:top w:val="single" w:color="5A9D46" w:sz="24" w:space="0"/>
+            <w:left w:val="none" w:color="auto" w:sz="0" w:space="0"/>
+            <w:bottom w:val="single" w:color="A4A4A4" w:sz="4" w:space="0"/>
+            <w:right w:val="none" w:color="auto" w:sz="0" w:space="0"/>
+            <w:insideH w:val="single" w:color="A4A4A4" w:sz="4" w:space="0"/>
+            <w:insideV w:val="single" w:color="A4A4A4" w:sz="4" w:space="0"/>
+          </w:tblBorders>
+          <w:tblCellMar>
+            <w:top w:w="0" w:type="dxa"/>
+            <w:left w:w="108" w:type="dxa"/>
+            <w:bottom w:w="0" w:type="dxa"/>
+            <w:right w:w="108" w:type="dxa"/>
+          </w:tblCellMar>
+        </w:tblPrEx>
+        <w:trPr>
+          <w:trHeight w:val="623" w:hRule="atLeast"/>
+          <w:jc w:val="center"/>
+        </w:trPr>
+        <w:tc>
+          <w:tcPr>
+            <w:tcW w:w="1529" w:type="dxa"/>
+            <w:tcBorders>
+              <w:tl2br w:val="nil"/>
+              <w:tr2bl w:val="nil"/>
+            </w:tcBorders>
+            <w:shd w:val="clear" w:color="auto" w:fill="auto"/>
+            <w:vAlign w:val="center"/>
+          </w:tcPr>
+          <w:p>
+            <w:pPr>
+              <w:adjustRightInd w:val="0"/>
+              <w:snapToGrid w:val="0"/>
+              <w:rPr>
+                <w:rFonts w:hint="default" w:ascii="Times New Roman" w:hAnsi="Times New Roman" w:eastAsia="微软雅黑" w:cs="Times New Roman"/>
+                <w:b/>
+                <w:kern w:val="0"/>
+                <w:sz w:val="21"/>
+                <w:szCs w:val="21"/>
+              </w:rPr>
+            </w:pPr>
+            <w:r>
+              <w:rPr>
+                <w:rFonts w:hint="default" w:ascii="Times New Roman" w:hAnsi="Times New Roman" w:eastAsia="微软雅黑" w:cs="Times New Roman"/>
+                <w:b/>
+                <w:kern w:val="0"/>
+                <w:sz w:val="21"/>
+                <w:szCs w:val="21"/>
+              </w:rPr>
+              <w:t>判读标准：</w:t>
+            </w:r>
+          </w:p>
+          <w:p>
+            <w:pPr>
+              <w:adjustRightInd w:val="0"/>
+              <w:snapToGrid w:val="0"/>
+              <w:spacing w:line="204" w:lineRule="auto"/>
+              <w:ind w:firstLine="440" w:firstLineChars="200"/>
+              <w:jc w:val="center"/>
+              <w:rPr>
+                <w:rFonts w:hint="eastAsia" w:ascii="Times New Roman" w:hAnsi="Times New Roman" w:eastAsia="微软雅黑" w:cs="Times New Roman"/>
+                <w:lang w:val="en-US" w:eastAsia="zh-CN"/>
+              </w:rPr>
+            </w:pPr>
+          </w:p>
+        </w:tc>
+        <w:tc>
+          <w:tcPr>
+            <w:tcW w:w="8987" w:type="dxa"/>
+            <w:gridSpan w:val="4"/>
+            <w:tcBorders>
+              <w:tl2br w:val="nil"/>
+              <w:tr2bl w:val="nil"/>
+            </w:tcBorders>
+            <w:shd w:val="clear" w:color="auto" w:fill="auto"/>
+            <w:vAlign w:val="center"/>
+          </w:tcPr>
+          <w:p>
+            <w:pPr>
+              <w:adjustRightInd w:val="0"/>
+              <w:snapToGrid w:val="0"/>
+              <w:spacing w:line="204" w:lineRule="auto"/>
+              <w:ind w:firstLine="440" w:firstLineChars="200"/>
+              <w:jc w:val="center"/>
+            </w:pPr>
+          </w:p>
+          <w:p>
+            <w:pPr>
+              <w:adjustRightInd w:val="0"/>
+              <w:snapToGrid w:val="0"/>
+              <w:spacing w:line="204" w:lineRule="auto"/>
+              <w:ind w:firstLine="440" w:firstLineChars="200"/>
+              <w:jc w:val="center"/>
+            </w:pPr>
+            <w:r>
+              <w:drawing>
+                <wp:inline distT="0" distB="0" distL="114300" distR="114300">
+                  <wp:extent cx="3860800" cy="1409700"/>
+                  <wp:effectExtent l="0" t="0" r="0" b="0"/>
+                  <wp:docPr id="9" name="图片 9"/>
+                  <wp:cNvGraphicFramePr>
+                    <a:graphicFrameLocks xmlns:a="http://schemas.openxmlformats.org/drawingml/2006/main" noChangeAspect="1"/>
+                  </wp:cNvGraphicFramePr>
+                  <a:graphic xmlns:a="http://schemas.openxmlformats.org/drawingml/2006/main">
+                    <a:graphicData uri="http://schemas.openxmlformats.org/drawingml/2006/picture">
+                      <pic:pic xmlns:pic="http://schemas.openxmlformats.org/drawingml/2006/picture">
+                        <pic:nvPicPr>
+                          <pic:cNvPr id="9" name="图片 9"/>
+                          <pic:cNvPicPr>
+                            <a:picLocks noChangeAspect="1"/>
+                          </pic:cNvPicPr>
+                        </pic:nvPicPr>
+                        <pic:blipFill>
+                          <a:blip r:embed="rId10"/>
+                          <a:stretch>
+                            <a:fillRect/>
+                          </a:stretch>
+                        </pic:blipFill>
+                        <pic:spPr>
+                          <a:xfrm>
+                            <a:off x="0" y="0"/>
+                            <a:ext cx="3860800" cy="1409700"/>
+                          </a:xfrm>
+                          <a:prstGeom prst="rect">
+                            <a:avLst/>
+                          </a:prstGeom>
+                          <a:noFill/>
+                          <a:ln>
+                            <a:noFill/>
+                          </a:ln>
+                        </pic:spPr>
+                      </pic:pic>
+                    </a:graphicData>
+                  </a:graphic>
+                </wp:inline>
+              </w:drawing>
+            </w:r>
+          </w:p>
+          <w:p>
+            <w:pPr>
+              <w:adjustRightInd w:val="0"/>
+              <w:snapToGrid w:val="0"/>
+              <w:spacing w:line="204" w:lineRule="auto"/>
+              <w:jc w:val="center"/>
+              <w:rPr>
+                <w:rFonts w:hint="eastAsia" w:ascii="Times New Roman" w:hAnsi="Times New Roman" w:eastAsia="微软雅黑" w:cs="Times New Roman"/>
+                <w:lang w:val="en-US" w:eastAsia="zh-CN"/>
+              </w:rPr>
+            </w:pPr>
+            <w:r>
+              <w:rPr>
+                <w:rFonts w:hint="eastAsia" w:ascii="微软雅黑" w:hAnsi="微软雅黑" w:eastAsia="微软雅黑" w:cs="微软雅黑"/>
+                <w:sz w:val="16"/>
+                <w:szCs w:val="16"/>
+                <w:lang w:val="en-US" w:eastAsia="zh-CN"/>
+              </w:rPr>
+              <w:t>注：Esophageal and Esophagogastric Junction Cancers NCCN 2025.V1</w:t>
+            </w:r>
+            <w:bookmarkStart w:id="31" w:name="_GoBack"/>
+            <w:bookmarkEnd w:id="31"/>
+          </w:p>
+        </w:tc>
+      </w:tr>
+      <w:tr>
+        <w:tblPrEx>
+          <w:tblBorders>
+            <w:top w:val="single" w:color="5A9D46" w:sz="24" w:space="0"/>
+            <w:left w:val="none" w:color="auto" w:sz="0" w:space="0"/>
+            <w:bottom w:val="single" w:color="A4A4A4" w:sz="4" w:space="0"/>
+            <w:right w:val="none" w:color="auto" w:sz="0" w:space="0"/>
+            <w:insideH w:val="single" w:color="A4A4A4" w:sz="4" w:space="0"/>
+            <w:insideV w:val="single" w:color="A4A4A4" w:sz="4" w:space="0"/>
+          </w:tblBorders>
+          <w:tblCellMar>
+            <w:top w:w="0" w:type="dxa"/>
+            <w:left w:w="108" w:type="dxa"/>
+            <w:bottom w:w="0" w:type="dxa"/>
+            <w:right w:w="108" w:type="dxa"/>
+          </w:tblCellMar>
+        </w:tblPrEx>
+        <w:trPr>
+          <w:trHeight w:val="623" w:hRule="atLeast"/>
+          <w:jc w:val="center"/>
+        </w:trPr>
+        <w:tc>
+          <w:tcPr>
+            <w:tcW w:w="10516" w:type="dxa"/>
+            <w:gridSpan w:val="5"/>
+            <w:tcBorders>
+              <w:tl2br w:val="nil"/>
+              <w:tr2bl w:val="nil"/>
+            </w:tcBorders>
+            <w:shd w:val="clear" w:color="auto" w:fill="auto"/>
+            <w:vAlign w:val="center"/>
+          </w:tcPr>
+          <w:p>
+            <w:pPr>
+              <w:adjustRightInd w:val="0"/>
+              <w:snapToGrid w:val="0"/>
+              <w:spacing w:line="204" w:lineRule="auto"/>
+              <w:ind w:firstLine="440" w:firstLineChars="200"/>
+              <w:jc w:val="center"/>
+              <w:rPr>
                 <w:rFonts w:hint="default" w:ascii="Times New Roman" w:hAnsi="Times New Roman" w:eastAsia="微软雅黑" w:cs="Times New Roman"/>
                 <w:color w:val="000000"/>
                 <w:sz w:val="16"/>
@@ -5884,7 +6387,7 @@
                           </pic:cNvPicPr>
                         </pic:nvPicPr>
                         <pic:blipFill>
-                          <a:blip r:embed="rId9"/>
+                          <a:blip r:embed="rId11"/>
                           <a:srcRect r="303"/>
                           <a:stretch>
                             <a:fillRect/>
@@ -5930,7 +6433,7 @@
                 <w:szCs w:val="16"/>
                 <w:lang w:val="en-US" w:eastAsia="zh-CN"/>
               </w:rPr>
-              <w:t>注：来源于胃癌胃镜活检标本HER-2检测中国专家共识（2023版）</w:t>
+              <w:t>注：来源于胃癌胃镜活检标本HER-2检测中国专家共识（2023版）&amp;胃癌HER2检测指南（2016版）</w:t>
             </w:r>
           </w:p>
         </w:tc>
@@ -6127,7 +6630,7 @@
                           </pic:cNvPicPr>
                         </pic:nvPicPr>
                         <pic:blipFill>
-                          <a:blip r:embed="rId10"/>
+                          <a:blip r:embed="rId12"/>
                           <a:stretch>
                             <a:fillRect/>
                           </a:stretch>
@@ -6398,7 +6901,7 @@
                           </pic:cNvPicPr>
                         </pic:nvPicPr>
                         <pic:blipFill>
-                          <a:blip r:embed="rId11"/>
+                          <a:blip r:embed="rId13"/>
                           <a:stretch>
                             <a:fillRect/>
                           </a:stretch>
@@ -6447,14 +6950,6 @@
       </w:tr>
       <w:tr>
         <w:tblPrEx>
-          <w:tblBorders>
-            <w:top w:val="single" w:color="5A9D46" w:sz="24" w:space="0"/>
-            <w:left w:val="none" w:color="auto" w:sz="0" w:space="0"/>
-            <w:bottom w:val="single" w:color="A4A4A4" w:sz="4" w:space="0"/>
-            <w:right w:val="none" w:color="auto" w:sz="0" w:space="0"/>
-            <w:insideH w:val="single" w:color="A4A4A4" w:sz="4" w:space="0"/>
-            <w:insideV w:val="single" w:color="A4A4A4" w:sz="4" w:space="0"/>
-          </w:tblBorders>
           <w:tblCellMar>
             <w:top w:w="0" w:type="dxa"/>
             <w:left w:w="108" w:type="dxa"/>
@@ -6752,7 +7247,6 @@
                 <w:sz w:val="16"/>
               </w:rPr>
             </w:pPr>
-            <w:bookmarkStart w:id="31" w:name="_GoBack"/>
             <w:r>
               <w:rPr>
                 <w:rFonts w:hint="eastAsia" w:eastAsia="微软雅黑"/>
@@ -6784,7 +7278,7 @@
                           </pic:cNvPicPr>
                         </pic:nvPicPr>
                         <pic:blipFill>
-                          <a:blip r:embed="rId12">
+                          <a:blip r:embed="rId14">
                             <a:clrChange>
                               <a:clrFrom>
                                 <a:srgbClr val="FFFFFF">
@@ -6818,7 +7312,6 @@
                 </wp:anchor>
               </w:drawing>
             </w:r>
-            <w:bookmarkEnd w:id="31"/>
           </w:p>
         </w:tc>
         <w:tc>
@@ -6994,7 +7487,7 @@
                     </pic:cNvPicPr>
                   </pic:nvPicPr>
                   <pic:blipFill>
-                    <a:blip r:embed="rId13">
+                    <a:blip r:embed="rId15">
                       <a:extLst>
                         <a:ext uri="{28A0092B-C50C-407E-A947-70E740481C1C}">
                           <a14:useLocalDpi xmlns:a14="http://schemas.microsoft.com/office/drawing/2010/main" val="0"/>

</xml_diff>